<commit_message>
Reorganizar repositorio completo y limpiar artefactos locales
</commit_message>
<xml_diff>
--- a/proyecto/TF_Juan_Bautista_Xifro_2026.docx
+++ b/proyecto/TF_Juan_Bautista_Xifro_2026.docx
@@ -7282,27 +7282,27 @@
           <w:szCs w:val="24"/>
           <w:rtl w:val="0"/>
         </w:rPr>
-        <w:t xml:space="preserve">Se utilizará el dataset público Bitext Customer Support LLM Chatbot Training Dataset, disponible en HuggingFace, que contiene más de 26.000 pares pregunta</w:t>
-      </w:r>
-      <w:r>
-        <w:rPr>
-          <w:rtl w:val="0"/>
-        </w:rPr>
-        <w:t xml:space="preserve"> </w:t>
-      </w:r>
-      <w:r>
-        <w:rPr>
-          <w:rFonts w:ascii="Times New Roman" w:cs="Times New Roman" w:eastAsia="Times New Roman" w:hAnsi="Times New Roman"/>
-          <w:sz w:val="24"/>
-          <w:szCs w:val="24"/>
-          <w:rtl w:val="0"/>
-        </w:rPr>
-        <w:t xml:space="preserve">respuesta de soporte al cliente en inglés, organizados en 27 categorías de intención. Este corpus permite evaluar los modelos sobre interacciones reales y proporciona respuestas de referencia humana para el cálculo de métricas automáticas. Para la base de conocimiento RAG se utilizará un subconjunto de documentos de política y procedimientos sintéticos, generados a partir del mismo dataset y almacenados en FAISS.</w:t>
-      </w:r>
-      <w:r>
-        <w:rPr>
-          <w:rtl w:val="0"/>
-        </w:rPr>
+        <w:t xml:space="preserve">Se utilizarÃ¡ el dataset pÃºblico Bitext Customer Support LLM Chatbot Training Dataset, disponible en </w:t>
+      </w:r>
+      <w:hyperlink r:id="rId15" w:history="1">
+        <w:r>
+          <w:rPr>
+            <w:rStyle w:val="Hyperlink"/>
+            <w:rFonts w:ascii="Times New Roman" w:cs="Times New Roman" w:eastAsia="Times New Roman" w:hAnsi="Times New Roman"/>
+            <w:sz w:val="24"/>
+            <w:szCs w:val="24"/>
+          </w:rPr>
+          <w:t>Hugging Face</w:t>
+        </w:r>
+      </w:hyperlink>
+      <w:r>
+        <w:rPr>
+          <w:rFonts w:ascii="Times New Roman" w:cs="Times New Roman" w:eastAsia="Times New Roman" w:hAnsi="Times New Roman"/>
+          <w:sz w:val="24"/>
+          <w:szCs w:val="24"/>
+          <w:rtl w:val="0"/>
+        </w:rPr>
+        <w:t xml:space="preserve">, (Bitext, s. f.), que contiene mÃ¡s de 26.000 pares pregunta respuesta de soporte al cliente en inglÃ©s, organizados en 11 categorÃ­as y 27 intenciones. Este corpus permite evaluar los modelos sobre interacciones reales y proporciona respuestas de referencia humana para el cÃ¡lculo de mÃ©tricas automÃ¡ticas. Para la base de conocimiento RAG se utilizarÃ¡ un subconjunto de documentos de polÃ­tica y procedimientos sintÃ©ticos, generados a partir del mismo dataset y almacenados en FAISS.</w:t>
       </w:r>
     </w:p>
     <w:p>
@@ -8018,6 +8018,34 @@
           <w:rtl w:val="0"/>
         </w:rPr>
       </w:r>
+    </w:p>
+    <w:p>
+      <w:pPr>
+        <w:spacing w:after="120" w:before="0" w:line="360" w:lineRule="auto"/>
+        <w:ind w:left="720" w:hanging="720"/>
+        <w:jc w:val="both"/>
+        <w:rPr/>
+      </w:pPr>
+      <w:r>
+        <w:rPr>
+          <w:rFonts w:ascii="Times New Roman" w:cs="Times New Roman" w:eastAsia="Times New Roman" w:hAnsi="Times New Roman"/>
+          <w:sz w:val="20"/>
+          <w:szCs w:val="20"/>
+          <w:rtl w:val="0"/>
+        </w:rPr>
+        <w:t xml:space="preserve">Bitext. (s. f.). Bitext Customer Support LLM Chatbot Training Dataset [Conjunto de datos]. Hugging Face. Recuperado el 14 de septiembre de 2026, de </w:t>
+      </w:r>
+      <w:hyperlink r:id="rId15" w:history="1">
+        <w:r>
+          <w:rPr>
+            <w:rStyle w:val="Hyperlink"/>
+            <w:rFonts w:ascii="Times New Roman" w:cs="Times New Roman" w:eastAsia="Times New Roman" w:hAnsi="Times New Roman"/>
+            <w:sz w:val="20"/>
+            <w:szCs w:val="20"/>
+          </w:rPr>
+          <w:t>https://huggingface.co/datasets/bitext/Bitext-customer-support-llm-chatbot-training-dataset</w:t>
+        </w:r>
+      </w:hyperlink>
     </w:p>
     <w:p>
       <w:pPr>

</xml_diff>